<commit_message>
docs(uml): adicionar especificacao formal dos Diagramas de Atividades (UML)
</commit_message>
<xml_diff>
--- a/PIM_Tronus_Desktop.docx
+++ b/PIM_Tronus_Desktop.docx
@@ -6439,6 +6439,235 @@
           <w:sz w:val="24"/>
         </w:rPr>
         <w:t>Métricas globais, busca de usuários, alternância de papéis RBAC e criação de contas de gestão.</w:t>
+      </w:r>
+    </w:p>
+    <w:p>
+      <w:pPr>
+        <w:keepNext/>
+        <w:spacing w:before="240" w:after="120"/>
+        <w:jc w:val="left"/>
+      </w:pPr>
+      <w:r>
+        <w:rPr>
+          <w:rFonts w:ascii="Arial" w:hAnsi="Arial"/>
+          <w:b/>
+          <w:color w:val="1A1A1A"/>
+          <w:sz w:val="24"/>
+        </w:rPr>
+        <w:t>9.4 Diagramas de Atividades Operacionais (DA01 a DA06)</w:t>
+      </w:r>
+    </w:p>
+    <w:p>
+      <w:pPr>
+        <w:spacing w:line="360" w:lineRule="auto" w:after="120" w:before="0"/>
+        <w:ind w:firstLine="709"/>
+        <w:jc w:val="both"/>
+      </w:pPr>
+      <w:r>
+        <w:rPr>
+          <w:rFonts w:ascii="Arial" w:hAnsi="Arial"/>
+          <w:color w:val="1A1A1A"/>
+          <w:sz w:val="24"/>
+        </w:rPr>
+        <w:t>Complementando a perspectiva funcional e temporal, foram elaborados os Diagramas de Atividades da UML 2.5, responsáveis por mapear os fluxos operacionais, bifurcações condicionais (decision nodes), sincronizações paralelas (fork/join) e a segregação estrita de responsabilidades por raias (swimlanes/partições) entre Usuário, Interface Desktop e Serviços de Nuvem/Memória. A especificação formal completa está documentada no artefato DiagramaDeAtividades.md, abrangendo 6 fluxos estratégicos:</w:t>
+      </w:r>
+    </w:p>
+    <w:p>
+      <w:pPr>
+        <w:spacing w:line="360" w:lineRule="auto" w:after="80"/>
+        <w:ind w:left="709" w:hanging="340"/>
+        <w:jc w:val="both"/>
+      </w:pPr>
+      <w:r>
+        <w:rPr>
+          <w:rFonts w:ascii="Arial" w:hAnsi="Arial"/>
+          <w:b/>
+          <w:color w:val="B8860B"/>
+          <w:sz w:val="24"/>
+        </w:rPr>
+        <w:t xml:space="preserve">• </w:t>
+      </w:r>
+      <w:r>
+        <w:rPr>
+          <w:rFonts w:ascii="Arial" w:hAnsi="Arial"/>
+          <w:b/>
+          <w:color w:val="1A1A1A"/>
+          <w:sz w:val="24"/>
+        </w:rPr>
+        <w:t xml:space="preserve">DA01 – Jornada Gamificada do Aluno (Resolução e Evolução): </w:t>
+      </w:r>
+      <w:r>
+        <w:rPr>
+          <w:rFonts w:ascii="Arial" w:hAnsi="Arial"/>
+          <w:color w:val="1A1A1A"/>
+          <w:sz w:val="24"/>
+        </w:rPr>
+        <w:t>Fluxo principal em UcReinos e UcQuiz: carregamento assíncrono de questões sem gabarito, seleção de alternativas, submissão em lote, atribuição de estrelas e recálculo dinâmico da patente nobiliárquica (Plebeu a Rei).</w:t>
+      </w:r>
+    </w:p>
+    <w:p>
+      <w:pPr>
+        <w:spacing w:line="360" w:lineRule="auto" w:after="80"/>
+        <w:ind w:left="709" w:hanging="340"/>
+        <w:jc w:val="both"/>
+      </w:pPr>
+      <w:r>
+        <w:rPr>
+          <w:rFonts w:ascii="Arial" w:hAnsi="Arial"/>
+          <w:b/>
+          <w:color w:val="B8860B"/>
+          <w:sz w:val="24"/>
+        </w:rPr>
+        <w:t xml:space="preserve">• </w:t>
+      </w:r>
+      <w:r>
+        <w:rPr>
+          <w:rFonts w:ascii="Arial" w:hAnsi="Arial"/>
+          <w:b/>
+          <w:color w:val="1A1A1A"/>
+          <w:sz w:val="24"/>
+        </w:rPr>
+        <w:t xml:space="preserve">DA02 – Resiliência Operacional e Fallback para o Modo Offline: </w:t>
+      </w:r>
+      <w:r>
+        <w:rPr>
+          <w:rFonts w:ascii="Arial" w:hAnsi="Arial"/>
+          <w:color w:val="1A1A1A"/>
+          <w:sz w:val="24"/>
+        </w:rPr>
+        <w:t>Mecanismo autônomo de tolerância a falhas: teste de conectividade HTTPS (porta 443), captura de timeouts/quedas e desvio transparente para o OfflineDataService com simulação em memória.</w:t>
+      </w:r>
+    </w:p>
+    <w:p>
+      <w:pPr>
+        <w:spacing w:line="360" w:lineRule="auto" w:after="80"/>
+        <w:ind w:left="709" w:hanging="340"/>
+        <w:jc w:val="both"/>
+      </w:pPr>
+      <w:r>
+        <w:rPr>
+          <w:rFonts w:ascii="Arial" w:hAnsi="Arial"/>
+          <w:b/>
+          <w:color w:val="B8860B"/>
+          <w:sz w:val="24"/>
+        </w:rPr>
+        <w:t xml:space="preserve">• </w:t>
+      </w:r>
+      <w:r>
+        <w:rPr>
+          <w:rFonts w:ascii="Arial" w:hAnsi="Arial"/>
+          <w:b/>
+          <w:color w:val="1A1A1A"/>
+          <w:sz w:val="24"/>
+        </w:rPr>
+        <w:t xml:space="preserve">DA03 – Gestão Pedagógica de Questões pelo Professor: </w:t>
+      </w:r>
+      <w:r>
+        <w:rPr>
+          <w:rFonts w:ascii="Arial" w:hAnsi="Arial"/>
+          <w:color w:val="1A1A1A"/>
+          <w:sz w:val="24"/>
+        </w:rPr>
+        <w:t>Ciclo de curadoria docente em UcProfessor: consulta filtrada por matéria, formulário de cadastro com 4 alternativas, validação de unicidade de gabarito e sincronização via API REST.</w:t>
+      </w:r>
+    </w:p>
+    <w:p>
+      <w:pPr>
+        <w:spacing w:line="360" w:lineRule="auto" w:after="80"/>
+        <w:ind w:left="709" w:hanging="340"/>
+        <w:jc w:val="both"/>
+      </w:pPr>
+      <w:r>
+        <w:rPr>
+          <w:rFonts w:ascii="Arial" w:hAnsi="Arial"/>
+          <w:b/>
+          <w:color w:val="B8860B"/>
+          <w:sz w:val="24"/>
+        </w:rPr>
+        <w:t xml:space="preserve">• </w:t>
+      </w:r>
+      <w:r>
+        <w:rPr>
+          <w:rFonts w:ascii="Arial" w:hAnsi="Arial"/>
+          <w:b/>
+          <w:color w:val="1A1A1A"/>
+          <w:sz w:val="24"/>
+        </w:rPr>
+        <w:t xml:space="preserve">DA04 – Recuperação Segura de Credenciais (Wizard SMS em 3 Etapas): </w:t>
+      </w:r>
+      <w:r>
+        <w:rPr>
+          <w:rFonts w:ascii="Arial" w:hAnsi="Arial"/>
+          <w:color w:val="1A1A1A"/>
+          <w:sz w:val="24"/>
+        </w:rPr>
+        <w:t>Fluxo guiado em UcForgotPassword: validação de celular/e-mail, geração e verificação temporizada de token SMS de 6 dígitos e redefinição com hashing e critérios de complexidade.</w:t>
+      </w:r>
+    </w:p>
+    <w:p>
+      <w:pPr>
+        <w:spacing w:line="360" w:lineRule="auto" w:after="80"/>
+        <w:ind w:left="709" w:hanging="340"/>
+        <w:jc w:val="both"/>
+      </w:pPr>
+      <w:r>
+        <w:rPr>
+          <w:rFonts w:ascii="Arial" w:hAnsi="Arial"/>
+          <w:b/>
+          <w:color w:val="B8860B"/>
+          <w:sz w:val="24"/>
+        </w:rPr>
+        <w:t xml:space="preserve">• </w:t>
+      </w:r>
+      <w:r>
+        <w:rPr>
+          <w:rFonts w:ascii="Arial" w:hAnsi="Arial"/>
+          <w:b/>
+          <w:color w:val="1A1A1A"/>
+          <w:sz w:val="24"/>
+        </w:rPr>
+        <w:t xml:space="preserve">DA05 – Governança Global e Gestão de Usuários pelo Administrador: </w:t>
+      </w:r>
+      <w:r>
+        <w:rPr>
+          <w:rFonts w:ascii="Arial" w:hAnsi="Arial"/>
+          <w:color w:val="1A1A1A"/>
+          <w:sz w:val="24"/>
+        </w:rPr>
+        <w:t>Painel corporativo em UcAdmin: auditoria de acessos, listagem paginada, alternância dinâmica de privilégios RBAC (Aluno, Professor, Administrador) e provisionamento de contas.</w:t>
+      </w:r>
+    </w:p>
+    <w:p>
+      <w:pPr>
+        <w:spacing w:line="360" w:lineRule="auto" w:after="80"/>
+        <w:ind w:left="709" w:hanging="340"/>
+        <w:jc w:val="both"/>
+      </w:pPr>
+      <w:r>
+        <w:rPr>
+          <w:rFonts w:ascii="Arial" w:hAnsi="Arial"/>
+          <w:b/>
+          <w:color w:val="B8860B"/>
+          <w:sz w:val="24"/>
+        </w:rPr>
+        <w:t xml:space="preserve">• </w:t>
+      </w:r>
+      <w:r>
+        <w:rPr>
+          <w:rFonts w:ascii="Arial" w:hAnsi="Arial"/>
+          <w:b/>
+          <w:color w:val="1A1A1A"/>
+          <w:sz w:val="24"/>
+        </w:rPr>
+        <w:t xml:space="preserve">DA06 – Ciclo Universal de Acessibilidade e Alternância de Temas: </w:t>
+      </w:r>
+      <w:r>
+        <w:rPr>
+          <w:rFonts w:ascii="Arial" w:hAnsi="Arial"/>
+          <w:color w:val="1A1A1A"/>
+          <w:sz w:val="24"/>
+        </w:rPr>
+        <w:t>Mecanismo global disparado via AccessibilityThemeButton ou atalhos de teclado (Ctrl+T / Alt+A): comutação imediata de paleta (Dark Fantasy vs. High Contrast Claro), preservação de planos de fundo e recálculo de luminância WCAG AAA.</w:t>
       </w:r>
     </w:p>
     <w:p>

</xml_diff>